<commit_message>
Update paper with GitHub URL and Kaggle submission evidence; add leaderboard results
</commit_message>
<xml_diff>
--- a/week3-subset-selection-regularization/paper/PerkinsB_DS8555_Week3.docx
+++ b/week3-subset-selection-regularization/paper/PerkinsB_DS8555_Week3.docx
@@ -163,8 +163,30 @@
           <w:sz w:val="24"/>
           <w:szCs w:val="24"/>
         </w:rPr>
-        <w:t xml:space="preserve">This paper asks how subset selection, regularization, and principal components regression choose useful predictors when candidate variables are many and highly correlated. The applied work continues the Week 2 Kaggle abalone competition. Code and output are held in three notebooks in the repository at </w:t>
-      </w:r>
+        <w:t xml:space="preserve">This paper asks how subset selection, regularization, and principal components regression choose predictors when candidates are many and correlated. The applied work continues the Week 2 Kaggle abalone competition. Code and output are held in three notebooks at </w:t>
+      </w:r>
+      <w:r>
+        <w:rPr>
+          <w:rFonts w:ascii="Times New Roman" w:cs="Times New Roman" w:eastAsia="Times New Roman" w:hAnsi="Times New Roman"/>
+          <w:sz w:val="24"/>
+          <w:szCs w:val="24"/>
+        </w:rPr>
+        <w:t xml:space="preserve">https://github.com/brandonm-max/DS8555-Predictive-Analysis</w:t>
+      </w:r>
+      <w:r>
+        <w:rPr>
+          <w:rFonts w:ascii="Times New Roman" w:cs="Times New Roman" w:eastAsia="Times New Roman" w:hAnsi="Times New Roman"/>
+          <w:sz w:val="24"/>
+          <w:szCs w:val="24"/>
+        </w:rPr>
+        <w:t xml:space="preserve">.</w:t>
+      </w:r>
+    </w:p>
+    <w:p>
+      <w:pPr>
+        <w:spacing w:line="480"/>
+        <w:jc w:val="center"/>
+      </w:pPr>
       <w:r>
         <w:rPr>
           <w:rFonts w:ascii="Times New Roman" w:cs="Times New Roman" w:eastAsia="Times New Roman" w:hAnsi="Times New Roman"/>
@@ -173,15 +195,21 @@
           <w:sz w:val="24"/>
           <w:szCs w:val="24"/>
         </w:rPr>
-        <w:t xml:space="preserve">[INSERT GITHUB REPOSITORY URL]</w:t>
-      </w:r>
-      <w:r>
-        <w:rPr>
-          <w:rFonts w:ascii="Times New Roman" w:cs="Times New Roman" w:eastAsia="Times New Roman" w:hAnsi="Times New Roman"/>
-          <w:sz w:val="24"/>
-          <w:szCs w:val="24"/>
-        </w:rPr>
-        <w:t xml:space="preserve">.</w:t>
+        <w:t xml:space="preserve">Question 1: Comparing Subset Selection Methods</w:t>
+      </w:r>
+    </w:p>
+    <w:p>
+      <w:pPr>
+        <w:spacing w:line="480"/>
+        <w:ind w:firstLine="720"/>
+      </w:pPr>
+      <w:r>
+        <w:rPr>
+          <w:rFonts w:ascii="Times New Roman" w:cs="Times New Roman" w:eastAsia="Times New Roman" w:hAnsi="Times New Roman"/>
+          <w:sz w:val="24"/>
+          <w:szCs w:val="24"/>
+        </w:rPr>
+        <w:t xml:space="preserve">Best subset selection always reaches the smallest training residual sum of squares, because it evaluates every combination of a given size, while stepwise methods search a restricted path. The smallest test error cannot be known in advance, since a full search has the greatest chance to overfit (James et al., 2023). Among the nesting claims, items i and ii are true because forward and backward selection are nested by design, while items iii, iv, and v are false. A simulation verified each answer, producing a case where the best one-variable model was later discarded.</w:t>
       </w:r>
     </w:p>
     <w:p>
@@ -197,7 +225,7 @@
           <w:sz w:val="24"/>
           <w:szCs w:val="24"/>
         </w:rPr>
-        <w:t xml:space="preserve">Question 1: Comparing Subset Selection Methods</w:t>
+        <w:t xml:space="preserve">Question 2: Stepwise Selection and the Lasso</w:t>
       </w:r>
     </w:p>
     <w:p>
@@ -211,7 +239,7 @@
           <w:sz w:val="24"/>
           <w:szCs w:val="24"/>
         </w:rPr>
-        <w:t xml:space="preserve">Best subset selection always reaches the smallest training residual sum of squares, because it evaluates every combination of a given size, while stepwise methods search a narrow path. The smallest test error cannot be known in advance, since a full search also has the greatest chance to overfit (James et al., 2023). Among the nesting claims, items i and ii are true because forward and backward selection are nested by design, while items iii, iv, and v are false. A simulation verified each answer, producing a case where the best one-variable model was discarded at the next size.</w:t>
+        <w:t xml:space="preserve">Mallow's criterion chose a five-term model although only three terms generated the data, and both stepwise methods agreed. The lasso was more parsimonious, retaining the first four powers after cross-validation set a penalty of 0.023 (Tibshirani, 1996). When the response rested on the seventh power alone, the result flipped: forward selection found it almost exactly, at 7.0026 against a true 7.0, while the lasso spread the signal across six related powers.</w:t>
       </w:r>
     </w:p>
     <w:p>
@@ -227,7 +255,7 @@
           <w:sz w:val="24"/>
           <w:szCs w:val="24"/>
         </w:rPr>
-        <w:t xml:space="preserve">Question 2: Stepwise Selection and the Lasso</w:t>
+        <w:t xml:space="preserve">Question 3: Regularization and Principal Components Regression</w:t>
       </w:r>
     </w:p>
     <w:p>
@@ -241,11 +269,12 @@
           <w:sz w:val="24"/>
           <w:szCs w:val="24"/>
         </w:rPr>
-        <w:t xml:space="preserve">Mallow's criterion chose a five-term model although only three terms made the data, and both stepwise methods agreed. The lasso was more parsimonious, retaining the first four powers after cross-validation set a penalty of 0.023 (Tibshirani, 1996). When the response rested on the seventh power alone, the result flipped: forward selection found that term almost exactly, at 7.0026 against a true 7.0, while the lasso spread the signal across six related powers.</w:t>
-      </w:r>
-    </w:p>
-    <w:p>
-      <w:pPr>
+        <w:t xml:space="preserve">A dictionary of 37 squared and interaction terms (Nash et al., 1994) produced variance inflation factors as high as 69.2. The one-standard-error lasso retained 19 terms and explained 70.3 percent of the variance, with a validation error of 0.1564. Principal components regression retained every component and scored 0.1559, showing that dimensionality reduction adds no gain when observations far outnumber predictors. Both outperformed the 0.2881 baseline and satisfied independence while violating normality and constant variance. Leaderboard scores of 0.15537 and 0.15484 preserved that ordering (see Appendix).</w:t>
+      </w:r>
+    </w:p>
+    <w:p>
+      <w:pPr>
+        <w:pageBreakBefore/>
         <w:spacing w:line="480"/>
         <w:jc w:val="center"/>
       </w:pPr>
@@ -257,21 +286,103 @@
           <w:sz w:val="24"/>
           <w:szCs w:val="24"/>
         </w:rPr>
-        <w:t xml:space="preserve">Question 3: Regularization and Principal Components Regression</w:t>
-      </w:r>
-    </w:p>
-    <w:p>
-      <w:pPr>
-        <w:spacing w:line="480"/>
-        <w:ind w:firstLine="720"/>
-      </w:pPr>
-      <w:r>
-        <w:rPr>
-          <w:rFonts w:ascii="Times New Roman" w:cs="Times New Roman" w:eastAsia="Times New Roman" w:hAnsi="Times New Roman"/>
-          <w:sz w:val="24"/>
-          <w:szCs w:val="24"/>
-        </w:rPr>
-        <w:t xml:space="preserve">A set of 37 squared and interaction terms from the abalone measurements (Nash et al., 1994) gave variance inflation factors as high as 69.2. The one-standard-error lasso kept 19 terms and explained 70.3 percent of the variance, with a validation error of 0.1564. Principal components regression retained every component and scored 0.1559, showing that dimensionality reduction adds no gain when observations greatly outnumber predictors. Both clearly outperformed the baseline of 0.2881, and both satisfied independence while violating normality and constant variance. Evidence of both submissions appears in the Appendix.</w:t>
+        <w:t xml:space="preserve">References</w:t>
+      </w:r>
+    </w:p>
+    <w:p>
+      <w:pPr>
+        <w:spacing w:line="480"/>
+        <w:ind w:left="720" w:hanging="720"/>
+      </w:pPr>
+      <w:r>
+        <w:rPr>
+          <w:rFonts w:ascii="Times New Roman" w:cs="Times New Roman" w:eastAsia="Times New Roman" w:hAnsi="Times New Roman"/>
+          <w:sz w:val="24"/>
+          <w:szCs w:val="24"/>
+        </w:rPr>
+        <w:t xml:space="preserve">James, G., Witten, D., Hastie, T., Tibshirani, R., &amp; Taylor, J. (2023). </w:t>
+      </w:r>
+      <w:r>
+        <w:rPr>
+          <w:rFonts w:ascii="Times New Roman" w:cs="Times New Roman" w:eastAsia="Times New Roman" w:hAnsi="Times New Roman"/>
+          <w:i/>
+          <w:iCs/>
+          <w:sz w:val="24"/>
+          <w:szCs w:val="24"/>
+        </w:rPr>
+        <w:t xml:space="preserve">An introduction to statistical learning with applications in Python</w:t>
+      </w:r>
+      <w:r>
+        <w:rPr>
+          <w:rFonts w:ascii="Times New Roman" w:cs="Times New Roman" w:eastAsia="Times New Roman" w:hAnsi="Times New Roman"/>
+          <w:sz w:val="24"/>
+          <w:szCs w:val="24"/>
+        </w:rPr>
+        <w:t xml:space="preserve">. Springer. https://doi.org/10.1007/978-3-031-38747-0</w:t>
+      </w:r>
+    </w:p>
+    <w:p>
+      <w:pPr>
+        <w:spacing w:line="480"/>
+        <w:ind w:left="720" w:hanging="720"/>
+      </w:pPr>
+      <w:r>
+        <w:rPr>
+          <w:rFonts w:ascii="Times New Roman" w:cs="Times New Roman" w:eastAsia="Times New Roman" w:hAnsi="Times New Roman"/>
+          <w:sz w:val="24"/>
+          <w:szCs w:val="24"/>
+        </w:rPr>
+        <w:t xml:space="preserve">Nash, W. J., Sellers, T. L., Talbot, S. R., Cawthorn, A. J., &amp; Ford, W. B. (1994). </w:t>
+      </w:r>
+      <w:r>
+        <w:rPr>
+          <w:rFonts w:ascii="Times New Roman" w:cs="Times New Roman" w:eastAsia="Times New Roman" w:hAnsi="Times New Roman"/>
+          <w:i/>
+          <w:iCs/>
+          <w:sz w:val="24"/>
+          <w:szCs w:val="24"/>
+        </w:rPr>
+        <w:t xml:space="preserve">The population biology of abalone (Haliotis species) in Tasmania</w:t>
+      </w:r>
+      <w:r>
+        <w:rPr>
+          <w:rFonts w:ascii="Times New Roman" w:cs="Times New Roman" w:eastAsia="Times New Roman" w:hAnsi="Times New Roman"/>
+          <w:sz w:val="24"/>
+          <w:szCs w:val="24"/>
+        </w:rPr>
+        <w:t xml:space="preserve"> (Technical Report No. 48). Sea Fisheries Division, Department of Primary Industry and Fisheries, Tasmania.</w:t>
+      </w:r>
+    </w:p>
+    <w:p>
+      <w:pPr>
+        <w:spacing w:line="480"/>
+        <w:ind w:left="720" w:hanging="720"/>
+      </w:pPr>
+      <w:r>
+        <w:rPr>
+          <w:rFonts w:ascii="Times New Roman" w:cs="Times New Roman" w:eastAsia="Times New Roman" w:hAnsi="Times New Roman"/>
+          <w:sz w:val="24"/>
+          <w:szCs w:val="24"/>
+        </w:rPr>
+        <w:t xml:space="preserve">Tibshirani, R. (1996). Regression shrinkage and selection via the lasso. </w:t>
+      </w:r>
+      <w:r>
+        <w:rPr>
+          <w:rFonts w:ascii="Times New Roman" w:cs="Times New Roman" w:eastAsia="Times New Roman" w:hAnsi="Times New Roman"/>
+          <w:i/>
+          <w:iCs/>
+          <w:sz w:val="24"/>
+          <w:szCs w:val="24"/>
+        </w:rPr>
+        <w:t xml:space="preserve">Journal of the Royal Statistical Society: Series B, 58</w:t>
+      </w:r>
+      <w:r>
+        <w:rPr>
+          <w:rFonts w:ascii="Times New Roman" w:cs="Times New Roman" w:eastAsia="Times New Roman" w:hAnsi="Times New Roman"/>
+          <w:sz w:val="24"/>
+          <w:szCs w:val="24"/>
+        </w:rPr>
+        <w:t xml:space="preserve">(1), 267–288. https://doi.org/10.1111/j.2517-6161.1996.tb02080.x</w:t>
       </w:r>
     </w:p>
     <w:p>
@@ -288,22 +399,28 @@
           <w:sz w:val="24"/>
           <w:szCs w:val="24"/>
         </w:rPr>
-        <w:t xml:space="preserve">References</w:t>
-      </w:r>
-    </w:p>
-    <w:p>
-      <w:pPr>
-        <w:spacing w:line="480"/>
-        <w:ind w:left="720" w:hanging="720"/>
-      </w:pPr>
-      <w:r>
-        <w:rPr>
-          <w:rFonts w:ascii="Times New Roman" w:cs="Times New Roman" w:eastAsia="Times New Roman" w:hAnsi="Times New Roman"/>
-          <w:sz w:val="24"/>
-          <w:szCs w:val="24"/>
-        </w:rPr>
-        <w:t xml:space="preserve">James, G., Witten, D., Hastie, T., Tibshirani, R., &amp; Taylor, J. (2023). </w:t>
-      </w:r>
+        <w:t xml:space="preserve">Appendix</w:t>
+      </w:r>
+    </w:p>
+    <w:p>
+      <w:pPr>
+        <w:spacing w:line="480"/>
+      </w:pPr>
+      <w:r>
+        <w:rPr>
+          <w:rFonts w:ascii="Times New Roman" w:cs="Times New Roman" w:eastAsia="Times New Roman" w:hAnsi="Times New Roman"/>
+          <w:b/>
+          <w:bCs/>
+          <w:sz w:val="24"/>
+          <w:szCs w:val="24"/>
+        </w:rPr>
+        <w:t xml:space="preserve">Figure A1</w:t>
+      </w:r>
+    </w:p>
+    <w:p>
+      <w:pPr>
+        <w:spacing w:line="480"/>
+      </w:pPr>
       <w:r>
         <w:rPr>
           <w:rFonts w:ascii="Times New Roman" w:cs="Times New Roman" w:eastAsia="Times New Roman" w:hAnsi="Times New Roman"/>
@@ -312,30 +429,59 @@
           <w:sz w:val="24"/>
           <w:szCs w:val="24"/>
         </w:rPr>
-        <w:t xml:space="preserve">An introduction to statistical learning with applications in Python</w:t>
-      </w:r>
-      <w:r>
-        <w:rPr>
-          <w:rFonts w:ascii="Times New Roman" w:cs="Times New Roman" w:eastAsia="Times New Roman" w:hAnsi="Times New Roman"/>
-          <w:sz w:val="24"/>
-          <w:szCs w:val="24"/>
-        </w:rPr>
-        <w:t xml:space="preserve">. Springer. https://doi.org/10.1007/978-3-031-38747-0</w:t>
-      </w:r>
-    </w:p>
-    <w:p>
-      <w:pPr>
-        <w:spacing w:line="480"/>
-        <w:ind w:left="720" w:hanging="720"/>
-      </w:pPr>
-      <w:r>
-        <w:rPr>
-          <w:rFonts w:ascii="Times New Roman" w:cs="Times New Roman" w:eastAsia="Times New Roman" w:hAnsi="Times New Roman"/>
-          <w:sz w:val="24"/>
-          <w:szCs w:val="24"/>
-        </w:rPr>
-        <w:t xml:space="preserve">Nash, W. J., Sellers, T. L., Talbot, S. R., Cawthorn, A. J., &amp; Ford, W. B. (1994). </w:t>
-      </w:r>
+        <w:t xml:space="preserve">Kaggle Submission Record for Both Week 3 Models</w:t>
+      </w:r>
+    </w:p>
+    <w:p>
+      <w:pPr>
+        <w:spacing w:after="120" w:before="120" w:line="240" w:lineRule="auto"/>
+        <w:jc w:val="center"/>
+      </w:pPr>
+      <w:r>
+        <w:drawing>
+          <wp:inline distT="0" distB="0" distL="0" distR="0">
+            <wp:extent cx="5486400" cy="2809875"/>
+            <wp:effectExtent t="0" r="0" b="0" l="0"/>
+            <wp:docPr id="1" name="" descr="" title=""/>
+            <wp:cNvGraphicFramePr>
+              <a:graphicFrameLocks xmlns:a="http://schemas.openxmlformats.org/drawingml/2006/main" noChangeAspect="1"/>
+            </wp:cNvGraphicFramePr>
+            <a:graphic xmlns:a="http://schemas.openxmlformats.org/drawingml/2006/main">
+              <a:graphicData uri="http://schemas.openxmlformats.org/drawingml/2006/picture">
+                <pic:pic xmlns:pic="http://schemas.openxmlformats.org/drawingml/2006/picture">
+                  <pic:nvPicPr>
+                    <pic:cNvPr id="0" name="" descr=""/>
+                    <pic:cNvPicPr>
+                      <a:picLocks noChangeAspect="1" noChangeArrowheads="1"/>
+                    </pic:cNvPicPr>
+                  </pic:nvPicPr>
+                  <pic:blipFill>
+                    <a:blip r:embed="rId8" cstate="none"/>
+                    <a:srcRect/>
+                    <a:stretch>
+                      <a:fillRect/>
+                    </a:stretch>
+                  </pic:blipFill>
+                  <pic:spPr bwMode="auto">
+                    <a:xfrm>
+                      <a:off x="0" y="0"/>
+                      <a:ext cx="5486400" cy="2809875"/>
+                    </a:xfrm>
+                    <a:prstGeom prst="rect">
+                      <a:avLst/>
+                    </a:prstGeom>
+                  </pic:spPr>
+                </pic:pic>
+              </a:graphicData>
+            </a:graphic>
+          </wp:inline>
+        </w:drawing>
+      </w:r>
+    </w:p>
+    <w:p>
+      <w:pPr>
+        <w:spacing w:line="480"/>
+      </w:pPr>
       <w:r>
         <w:rPr>
           <w:rFonts w:ascii="Times New Roman" w:cs="Times New Roman" w:eastAsia="Times New Roman" w:hAnsi="Times New Roman"/>
@@ -344,30 +490,37 @@
           <w:sz w:val="24"/>
           <w:szCs w:val="24"/>
         </w:rPr>
-        <w:t xml:space="preserve">The population biology of abalone (Haliotis species) in Tasmania</w:t>
-      </w:r>
-      <w:r>
-        <w:rPr>
-          <w:rFonts w:ascii="Times New Roman" w:cs="Times New Roman" w:eastAsia="Times New Roman" w:hAnsi="Times New Roman"/>
-          <w:sz w:val="24"/>
-          <w:szCs w:val="24"/>
-        </w:rPr>
-        <w:t xml:space="preserve"> (Technical Report No. 48). Sea Fisheries Division, Department of Primary Industry and Fisheries, Tasmania.</w:t>
-      </w:r>
-    </w:p>
-    <w:p>
-      <w:pPr>
-        <w:spacing w:line="480"/>
-        <w:ind w:left="720" w:hanging="720"/>
-      </w:pPr>
-      <w:r>
-        <w:rPr>
-          <w:rFonts w:ascii="Times New Roman" w:cs="Times New Roman" w:eastAsia="Times New Roman" w:hAnsi="Times New Roman"/>
-          <w:sz w:val="24"/>
-          <w:szCs w:val="24"/>
-        </w:rPr>
-        <w:t xml:space="preserve">Tibshirani, R. (1996). Regression shrinkage and selection via the lasso. </w:t>
-      </w:r>
+        <w:t xml:space="preserve">Note. </w:t>
+      </w:r>
+      <w:r>
+        <w:rPr>
+          <w:rFonts w:ascii="Times New Roman" w:cs="Times New Roman" w:eastAsia="Times New Roman" w:hAnsi="Times New Roman"/>
+          <w:sz w:val="24"/>
+          <w:szCs w:val="24"/>
+        </w:rPr>
+        <w:t xml:space="preserve">Both Week 3 submissions completed successfully. The principal components model (submission_pcr.csv) scored .15484 on the public leaderboard and .15376 privately, while the lasso-selected subset model (submission_lasso_subset.csv) scored .15537 publicly and .15440 privately. The Week 2 gradient boosting entry (submission.csv) appears for comparison. The metric is root mean squared logarithmic error, for which lower values are better.</w:t>
+      </w:r>
+    </w:p>
+    <w:p>
+      <w:pPr>
+        <w:pageBreakBefore/>
+        <w:spacing w:line="480"/>
+      </w:pPr>
+      <w:r>
+        <w:rPr>
+          <w:rFonts w:ascii="Times New Roman" w:cs="Times New Roman" w:eastAsia="Times New Roman" w:hAnsi="Times New Roman"/>
+          <w:b/>
+          <w:bCs/>
+          <w:sz w:val="24"/>
+          <w:szCs w:val="24"/>
+        </w:rPr>
+        <w:t xml:space="preserve">Figure A2</w:t>
+      </w:r>
+    </w:p>
+    <w:p>
+      <w:pPr>
+        <w:spacing w:line="480"/>
+      </w:pPr>
       <w:r>
         <w:rPr>
           <w:rFonts w:ascii="Times New Roman" w:cs="Times New Roman" w:eastAsia="Times New Roman" w:hAnsi="Times New Roman"/>
@@ -376,47 +529,53 @@
           <w:sz w:val="24"/>
           <w:szCs w:val="24"/>
         </w:rPr>
-        <w:t xml:space="preserve">Journal of the Royal Statistical Society: Series B, 58</w:t>
-      </w:r>
-      <w:r>
-        <w:rPr>
-          <w:rFonts w:ascii="Times New Roman" w:cs="Times New Roman" w:eastAsia="Times New Roman" w:hAnsi="Times New Roman"/>
-          <w:sz w:val="24"/>
-          <w:szCs w:val="24"/>
-        </w:rPr>
-        <w:t xml:space="preserve">(1), 267–288. https://doi.org/10.1111/j.2517-6161.1996.tb02080.x</w:t>
-      </w:r>
-    </w:p>
-    <w:p>
-      <w:pPr>
-        <w:pageBreakBefore/>
-        <w:spacing w:line="480"/>
-        <w:jc w:val="center"/>
-      </w:pPr>
-      <w:r>
-        <w:rPr>
-          <w:rFonts w:ascii="Times New Roman" w:cs="Times New Roman" w:eastAsia="Times New Roman" w:hAnsi="Times New Roman"/>
-          <w:b/>
-          <w:bCs/>
-          <w:sz w:val="24"/>
-          <w:szCs w:val="24"/>
-        </w:rPr>
-        <w:t xml:space="preserve">Appendix</w:t>
-      </w:r>
-    </w:p>
-    <w:p>
-      <w:pPr>
-        <w:spacing w:line="480"/>
-      </w:pPr>
-      <w:r>
-        <w:rPr>
-          <w:rFonts w:ascii="Times New Roman" w:cs="Times New Roman" w:eastAsia="Times New Roman" w:hAnsi="Times New Roman"/>
-          <w:b/>
-          <w:bCs/>
-          <w:sz w:val="24"/>
-          <w:szCs w:val="24"/>
-        </w:rPr>
-        <w:t xml:space="preserve">Figure A1</w:t>
+        <w:t xml:space="preserve">Kaggle Leaderboard Confirmation of Successful Late Submission</w:t>
+      </w:r>
+    </w:p>
+    <w:p>
+      <w:pPr>
+        <w:spacing w:after="120" w:before="120" w:line="240" w:lineRule="auto"/>
+        <w:jc w:val="center"/>
+      </w:pPr>
+      <w:r>
+        <w:drawing>
+          <wp:inline distT="0" distB="0" distL="0" distR="0">
+            <wp:extent cx="5486400" cy="2305050"/>
+            <wp:effectExtent t="0" r="0" b="0" l="0"/>
+            <wp:docPr id="1" name="" descr="" title=""/>
+            <wp:cNvGraphicFramePr>
+              <a:graphicFrameLocks xmlns:a="http://schemas.openxmlformats.org/drawingml/2006/main" noChangeAspect="1"/>
+            </wp:cNvGraphicFramePr>
+            <a:graphic xmlns:a="http://schemas.openxmlformats.org/drawingml/2006/main">
+              <a:graphicData uri="http://schemas.openxmlformats.org/drawingml/2006/picture">
+                <pic:pic xmlns:pic="http://schemas.openxmlformats.org/drawingml/2006/picture">
+                  <pic:nvPicPr>
+                    <pic:cNvPr id="0" name="" descr=""/>
+                    <pic:cNvPicPr>
+                      <a:picLocks noChangeAspect="1" noChangeArrowheads="1"/>
+                    </pic:cNvPicPr>
+                  </pic:nvPicPr>
+                  <pic:blipFill>
+                    <a:blip r:embed="rId9" cstate="none"/>
+                    <a:srcRect/>
+                    <a:stretch>
+                      <a:fillRect/>
+                    </a:stretch>
+                  </pic:blipFill>
+                  <pic:spPr bwMode="auto">
+                    <a:xfrm>
+                      <a:off x="0" y="0"/>
+                      <a:ext cx="5486400" cy="2305050"/>
+                    </a:xfrm>
+                    <a:prstGeom prst="rect">
+                      <a:avLst/>
+                    </a:prstGeom>
+                  </pic:spPr>
+                </pic:pic>
+              </a:graphicData>
+            </a:graphic>
+          </wp:inline>
+        </w:drawing>
       </w:r>
     </w:p>
     <w:p>
@@ -431,37 +590,6 @@
           <w:sz w:val="24"/>
           <w:szCs w:val="24"/>
         </w:rPr>
-        <w:t xml:space="preserve">Kaggle Leaderboard Confirmation for the Lasso-Selected Subset Model</w:t>
-      </w:r>
-    </w:p>
-    <w:p>
-      <w:pPr>
-        <w:spacing w:line="480"/>
-        <w:jc w:val="center"/>
-      </w:pPr>
-      <w:r>
-        <w:rPr>
-          <w:rFonts w:ascii="Times New Roman" w:cs="Times New Roman" w:eastAsia="Times New Roman" w:hAnsi="Times New Roman"/>
-          <w:b/>
-          <w:bCs/>
-          <w:sz w:val="24"/>
-          <w:szCs w:val="24"/>
-        </w:rPr>
-        <w:t xml:space="preserve">[INSERT SCREENSHOT: submission_lasso_subset.csv leaderboard score]</w:t>
-      </w:r>
-    </w:p>
-    <w:p>
-      <w:pPr>
-        <w:spacing w:line="480"/>
-      </w:pPr>
-      <w:r>
-        <w:rPr>
-          <w:rFonts w:ascii="Times New Roman" w:cs="Times New Roman" w:eastAsia="Times New Roman" w:hAnsi="Times New Roman"/>
-          <w:i/>
-          <w:iCs/>
-          <w:sz w:val="24"/>
-          <w:szCs w:val="24"/>
-        </w:rPr>
         <w:t xml:space="preserve">Note. </w:t>
       </w:r>
       <w:r>
@@ -470,76 +598,7 @@
           <w:sz w:val="24"/>
           <w:szCs w:val="24"/>
         </w:rPr>
-        <w:t xml:space="preserve">Public leaderboard score for submission_lasso_subset.csv, submitted by Brandon Perkins to the Kaggle Playground Series S4E4 competition. The metric is root mean squared logarithmic error.</w:t>
-      </w:r>
-    </w:p>
-    <w:p>
-      <w:pPr>
-        <w:spacing w:line="480"/>
-      </w:pPr>
-      <w:r>
-        <w:rPr>
-          <w:rFonts w:ascii="Times New Roman" w:cs="Times New Roman" w:eastAsia="Times New Roman" w:hAnsi="Times New Roman"/>
-          <w:b/>
-          <w:bCs/>
-          <w:sz w:val="24"/>
-          <w:szCs w:val="24"/>
-        </w:rPr>
-        <w:t xml:space="preserve">Figure A2</w:t>
-      </w:r>
-    </w:p>
-    <w:p>
-      <w:pPr>
-        <w:spacing w:line="480"/>
-      </w:pPr>
-      <w:r>
-        <w:rPr>
-          <w:rFonts w:ascii="Times New Roman" w:cs="Times New Roman" w:eastAsia="Times New Roman" w:hAnsi="Times New Roman"/>
-          <w:i/>
-          <w:iCs/>
-          <w:sz w:val="24"/>
-          <w:szCs w:val="24"/>
-        </w:rPr>
-        <w:t xml:space="preserve">Kaggle Leaderboard Confirmation for the Principal Components Regression Model</w:t>
-      </w:r>
-    </w:p>
-    <w:p>
-      <w:pPr>
-        <w:spacing w:line="480"/>
-        <w:jc w:val="center"/>
-      </w:pPr>
-      <w:r>
-        <w:rPr>
-          <w:rFonts w:ascii="Times New Roman" w:cs="Times New Roman" w:eastAsia="Times New Roman" w:hAnsi="Times New Roman"/>
-          <w:b/>
-          <w:bCs/>
-          <w:sz w:val="24"/>
-          <w:szCs w:val="24"/>
-        </w:rPr>
-        <w:t xml:space="preserve">[INSERT SCREENSHOT: submission_pcr.csv leaderboard score]</w:t>
-      </w:r>
-    </w:p>
-    <w:p>
-      <w:pPr>
-        <w:spacing w:line="480"/>
-      </w:pPr>
-      <w:r>
-        <w:rPr>
-          <w:rFonts w:ascii="Times New Roman" w:cs="Times New Roman" w:eastAsia="Times New Roman" w:hAnsi="Times New Roman"/>
-          <w:i/>
-          <w:iCs/>
-          <w:sz w:val="24"/>
-          <w:szCs w:val="24"/>
-        </w:rPr>
-        <w:t xml:space="preserve">Note. </w:t>
-      </w:r>
-      <w:r>
-        <w:rPr>
-          <w:rFonts w:ascii="Times New Roman" w:cs="Times New Roman" w:eastAsia="Times New Roman" w:hAnsi="Times New Roman"/>
-          <w:sz w:val="24"/>
-          <w:szCs w:val="24"/>
-        </w:rPr>
-        <w:t xml:space="preserve">Public leaderboard score for submission_pcr.csv, submitted by Brandon Perkins to the same competition.</w:t>
+        <w:t xml:space="preserve">Leaderboard confirmation for submission_pcr.csv, submitted by Brandon Perkins to the Kaggle Playground Series S4E4 competition, Regression with an Abalone Dataset.</w:t>
       </w:r>
     </w:p>
     <w:sectPr>

</xml_diff>